<commit_message>
se actualizo el link del instagram
</commit_message>
<xml_diff>
--- a/tarjeta json.docx
+++ b/tarjeta json.docx
@@ -5,7 +5,67 @@
     <w:p>
       <w:r>
         <w:drawing>
-          <wp:anchor distT="0" distB="0" distL="114300" distR="114300" simplePos="0" relativeHeight="251660288" behindDoc="0" locked="0" layoutInCell="1" allowOverlap="1" wp14:anchorId="12B8A75F" wp14:editId="0D8CF70D">
+          <wp:anchor distT="0" distB="0" distL="114300" distR="114300" simplePos="0" relativeHeight="251661312" behindDoc="0" locked="0" layoutInCell="1" allowOverlap="1" wp14:anchorId="441C6A15" wp14:editId="1D074D86">
+            <wp:simplePos x="0" y="0"/>
+            <wp:positionH relativeFrom="column">
+              <wp:posOffset>-763284</wp:posOffset>
+            </wp:positionH>
+            <wp:positionV relativeFrom="paragraph">
+              <wp:posOffset>-984795</wp:posOffset>
+            </wp:positionV>
+            <wp:extent cx="3278282" cy="1771594"/>
+            <wp:effectExtent l="0" t="0" r="0" b="635"/>
+            <wp:wrapNone/>
+            <wp:docPr id="1" name="Imagen 1"/>
+            <wp:cNvGraphicFramePr>
+              <a:graphicFrameLocks xmlns:a="http://schemas.openxmlformats.org/drawingml/2006/main" noChangeAspect="1"/>
+            </wp:cNvGraphicFramePr>
+            <a:graphic xmlns:a="http://schemas.openxmlformats.org/drawingml/2006/main">
+              <a:graphicData uri="http://schemas.openxmlformats.org/drawingml/2006/picture">
+                <pic:pic xmlns:pic="http://schemas.openxmlformats.org/drawingml/2006/picture">
+                  <pic:nvPicPr>
+                    <pic:cNvPr id="1" name=""/>
+                    <pic:cNvPicPr/>
+                  </pic:nvPicPr>
+                  <pic:blipFill>
+                    <a:blip r:embed="rId4">
+                      <a:extLst>
+                        <a:ext uri="{28A0092B-C50C-407E-A947-70E740481C1C}">
+                          <a14:useLocalDpi xmlns:a14="http://schemas.microsoft.com/office/drawing/2010/main" val="0"/>
+                        </a:ext>
+                      </a:extLst>
+                    </a:blip>
+                    <a:stretch>
+                      <a:fillRect/>
+                    </a:stretch>
+                  </pic:blipFill>
+                  <pic:spPr>
+                    <a:xfrm>
+                      <a:off x="0" y="0"/>
+                      <a:ext cx="3356484" cy="1813855"/>
+                    </a:xfrm>
+                    <a:prstGeom prst="rect">
+                      <a:avLst/>
+                    </a:prstGeom>
+                  </pic:spPr>
+                </pic:pic>
+              </a:graphicData>
+            </a:graphic>
+            <wp14:sizeRelH relativeFrom="margin">
+              <wp14:pctWidth>0</wp14:pctWidth>
+            </wp14:sizeRelH>
+            <wp14:sizeRelV relativeFrom="margin">
+              <wp14:pctHeight>0</wp14:pctHeight>
+            </wp14:sizeRelV>
+          </wp:anchor>
+        </w:drawing>
+      </w:r>
+      <w:r>
+        <w:rPr>
+          <w:noProof/>
+        </w:rPr>
+        <w:drawing>
+          <wp:anchor distT="0" distB="0" distL="114300" distR="114300" simplePos="0" relativeHeight="251660288" behindDoc="0" locked="0" layoutInCell="1" allowOverlap="1" wp14:anchorId="12B8A75F" wp14:editId="79EAC54D">
             <wp:simplePos x="0" y="0"/>
             <wp:positionH relativeFrom="page">
               <wp:posOffset>138989</wp:posOffset>
@@ -28,7 +88,7 @@
                     <pic:cNvPicPr/>
                   </pic:nvPicPr>
                   <pic:blipFill>
-                    <a:blip r:embed="rId4" cstate="print">
+                    <a:blip r:embed="rId5" cstate="print">
                       <a:extLst>
                         <a:ext uri="{28A0092B-C50C-407E-A947-70E740481C1C}">
                           <a14:useLocalDpi xmlns:a14="http://schemas.microsoft.com/office/drawing/2010/main" val="0"/>

</xml_diff>

<commit_message>
se realizo los cambios en varias vistas del html como por ejemplo se quito los banners de experiencia y se cambio unos enlances de direccion
</commit_message>
<xml_diff>
--- a/tarjeta json.docx
+++ b/tarjeta json.docx
@@ -4,19 +4,22 @@
   <w:body>
     <w:p>
       <w:r>
+        <w:rPr>
+          <w:noProof/>
+        </w:rPr>
         <w:drawing>
-          <wp:anchor distT="0" distB="0" distL="114300" distR="114300" simplePos="0" relativeHeight="251661312" behindDoc="0" locked="0" layoutInCell="1" allowOverlap="1" wp14:anchorId="441C6A15" wp14:editId="1D074D86">
+          <wp:anchor distT="0" distB="0" distL="114300" distR="114300" simplePos="0" relativeHeight="251677696" behindDoc="0" locked="0" layoutInCell="1" allowOverlap="1" wp14:anchorId="541A5A02" wp14:editId="21752FC6">
             <wp:simplePos x="0" y="0"/>
             <wp:positionH relativeFrom="column">
-              <wp:posOffset>-763284</wp:posOffset>
+              <wp:posOffset>5788025</wp:posOffset>
             </wp:positionH>
             <wp:positionV relativeFrom="paragraph">
-              <wp:posOffset>-984795</wp:posOffset>
+              <wp:posOffset>4570730</wp:posOffset>
             </wp:positionV>
-            <wp:extent cx="3278282" cy="1771594"/>
-            <wp:effectExtent l="0" t="0" r="0" b="635"/>
+            <wp:extent cx="3270250" cy="1772285"/>
+            <wp:effectExtent l="0" t="0" r="6350" b="0"/>
             <wp:wrapNone/>
-            <wp:docPr id="1" name="Imagen 1"/>
+            <wp:docPr id="24" name="Imagen 24"/>
             <wp:cNvGraphicFramePr>
               <a:graphicFrameLocks xmlns:a="http://schemas.openxmlformats.org/drawingml/2006/main" noChangeAspect="1"/>
             </wp:cNvGraphicFramePr>
@@ -24,11 +27,11 @@
               <a:graphicData uri="http://schemas.openxmlformats.org/drawingml/2006/picture">
                 <pic:pic xmlns:pic="http://schemas.openxmlformats.org/drawingml/2006/picture">
                   <pic:nvPicPr>
-                    <pic:cNvPr id="1" name=""/>
+                    <pic:cNvPr id="1" name="Imagen 1"/>
                     <pic:cNvPicPr/>
                   </pic:nvPicPr>
                   <pic:blipFill>
-                    <a:blip r:embed="rId4">
+                    <a:blip r:embed="rId4" cstate="print">
                       <a:extLst>
                         <a:ext uri="{28A0092B-C50C-407E-A947-70E740481C1C}">
                           <a14:useLocalDpi xmlns:a14="http://schemas.microsoft.com/office/drawing/2010/main" val="0"/>
@@ -42,7 +45,7 @@
                   <pic:spPr>
                     <a:xfrm>
                       <a:off x="0" y="0"/>
-                      <a:ext cx="3356484" cy="1813855"/>
+                      <a:ext cx="3270250" cy="1772285"/>
                     </a:xfrm>
                     <a:prstGeom prst="rect">
                       <a:avLst/>
@@ -65,18 +68,18 @@
           <w:noProof/>
         </w:rPr>
         <w:drawing>
-          <wp:anchor distT="0" distB="0" distL="114300" distR="114300" simplePos="0" relativeHeight="251660288" behindDoc="0" locked="0" layoutInCell="1" allowOverlap="1" wp14:anchorId="12B8A75F" wp14:editId="79EAC54D">
+          <wp:anchor distT="0" distB="0" distL="114300" distR="114300" simplePos="0" relativeHeight="251676672" behindDoc="0" locked="0" layoutInCell="1" allowOverlap="1" wp14:anchorId="3D6117C7" wp14:editId="0DE1909B">
             <wp:simplePos x="0" y="0"/>
-            <wp:positionH relativeFrom="page">
-              <wp:posOffset>138989</wp:posOffset>
+            <wp:positionH relativeFrom="column">
+              <wp:posOffset>2478405</wp:posOffset>
             </wp:positionH>
             <wp:positionV relativeFrom="paragraph">
-              <wp:posOffset>-985037</wp:posOffset>
+              <wp:posOffset>4573270</wp:posOffset>
             </wp:positionV>
-            <wp:extent cx="3276201" cy="1770278"/>
-            <wp:effectExtent l="0" t="0" r="635" b="1905"/>
+            <wp:extent cx="3270250" cy="1772285"/>
+            <wp:effectExtent l="0" t="0" r="6350" b="0"/>
             <wp:wrapNone/>
-            <wp:docPr id="3" name="Imagen 3"/>
+            <wp:docPr id="23" name="Imagen 23"/>
             <wp:cNvGraphicFramePr>
               <a:graphicFrameLocks xmlns:a="http://schemas.openxmlformats.org/drawingml/2006/main" noChangeAspect="1"/>
             </wp:cNvGraphicFramePr>
@@ -84,11 +87,11 @@
               <a:graphicData uri="http://schemas.openxmlformats.org/drawingml/2006/picture">
                 <pic:pic xmlns:pic="http://schemas.openxmlformats.org/drawingml/2006/picture">
                   <pic:nvPicPr>
-                    <pic:cNvPr id="1" name=""/>
+                    <pic:cNvPr id="1" name="Imagen 1"/>
                     <pic:cNvPicPr/>
                   </pic:nvPicPr>
                   <pic:blipFill>
-                    <a:blip r:embed="rId5" cstate="print">
+                    <a:blip r:embed="rId4" cstate="print">
                       <a:extLst>
                         <a:ext uri="{28A0092B-C50C-407E-A947-70E740481C1C}">
                           <a14:useLocalDpi xmlns:a14="http://schemas.microsoft.com/office/drawing/2010/main" val="0"/>
@@ -102,7 +105,607 @@
                   <pic:spPr>
                     <a:xfrm>
                       <a:off x="0" y="0"/>
-                      <a:ext cx="3281834" cy="1773322"/>
+                      <a:ext cx="3270250" cy="1772285"/>
+                    </a:xfrm>
+                    <a:prstGeom prst="rect">
+                      <a:avLst/>
+                    </a:prstGeom>
+                  </pic:spPr>
+                </pic:pic>
+              </a:graphicData>
+            </a:graphic>
+            <wp14:sizeRelH relativeFrom="margin">
+              <wp14:pctWidth>0</wp14:pctWidth>
+            </wp14:sizeRelH>
+            <wp14:sizeRelV relativeFrom="margin">
+              <wp14:pctHeight>0</wp14:pctHeight>
+            </wp14:sizeRelV>
+          </wp:anchor>
+        </w:drawing>
+      </w:r>
+      <w:r>
+        <w:rPr>
+          <w:noProof/>
+        </w:rPr>
+        <w:drawing>
+          <wp:anchor distT="0" distB="0" distL="114300" distR="114300" simplePos="0" relativeHeight="251675648" behindDoc="0" locked="0" layoutInCell="1" allowOverlap="1" wp14:anchorId="32FF37AE" wp14:editId="2AF4D6CF">
+            <wp:simplePos x="0" y="0"/>
+            <wp:positionH relativeFrom="column">
+              <wp:posOffset>-818353</wp:posOffset>
+            </wp:positionH>
+            <wp:positionV relativeFrom="paragraph">
+              <wp:posOffset>4584745</wp:posOffset>
+            </wp:positionV>
+            <wp:extent cx="3270250" cy="1772285"/>
+            <wp:effectExtent l="0" t="0" r="6350" b="0"/>
+            <wp:wrapNone/>
+            <wp:docPr id="22" name="Imagen 22"/>
+            <wp:cNvGraphicFramePr>
+              <a:graphicFrameLocks xmlns:a="http://schemas.openxmlformats.org/drawingml/2006/main" noChangeAspect="1"/>
+            </wp:cNvGraphicFramePr>
+            <a:graphic xmlns:a="http://schemas.openxmlformats.org/drawingml/2006/main">
+              <a:graphicData uri="http://schemas.openxmlformats.org/drawingml/2006/picture">
+                <pic:pic xmlns:pic="http://schemas.openxmlformats.org/drawingml/2006/picture">
+                  <pic:nvPicPr>
+                    <pic:cNvPr id="1" name="Imagen 1"/>
+                    <pic:cNvPicPr/>
+                  </pic:nvPicPr>
+                  <pic:blipFill>
+                    <a:blip r:embed="rId4" cstate="print">
+                      <a:extLst>
+                        <a:ext uri="{28A0092B-C50C-407E-A947-70E740481C1C}">
+                          <a14:useLocalDpi xmlns:a14="http://schemas.microsoft.com/office/drawing/2010/main" val="0"/>
+                        </a:ext>
+                      </a:extLst>
+                    </a:blip>
+                    <a:stretch>
+                      <a:fillRect/>
+                    </a:stretch>
+                  </pic:blipFill>
+                  <pic:spPr>
+                    <a:xfrm>
+                      <a:off x="0" y="0"/>
+                      <a:ext cx="3270250" cy="1772285"/>
+                    </a:xfrm>
+                    <a:prstGeom prst="rect">
+                      <a:avLst/>
+                    </a:prstGeom>
+                  </pic:spPr>
+                </pic:pic>
+              </a:graphicData>
+            </a:graphic>
+            <wp14:sizeRelH relativeFrom="margin">
+              <wp14:pctWidth>0</wp14:pctWidth>
+            </wp14:sizeRelH>
+            <wp14:sizeRelV relativeFrom="margin">
+              <wp14:pctHeight>0</wp14:pctHeight>
+            </wp14:sizeRelV>
+          </wp:anchor>
+        </w:drawing>
+      </w:r>
+      <w:r>
+        <w:rPr>
+          <w:noProof/>
+        </w:rPr>
+        <w:drawing>
+          <wp:anchor distT="0" distB="0" distL="114300" distR="114300" simplePos="0" relativeHeight="251663360" behindDoc="0" locked="0" layoutInCell="1" allowOverlap="1" wp14:anchorId="70546775" wp14:editId="68088C22">
+            <wp:simplePos x="0" y="0"/>
+            <wp:positionH relativeFrom="column">
+              <wp:posOffset>2495550</wp:posOffset>
+            </wp:positionH>
+            <wp:positionV relativeFrom="paragraph">
+              <wp:posOffset>-911860</wp:posOffset>
+            </wp:positionV>
+            <wp:extent cx="3270250" cy="1772285"/>
+            <wp:effectExtent l="0" t="0" r="6350" b="0"/>
+            <wp:wrapNone/>
+            <wp:docPr id="12" name="Imagen 12"/>
+            <wp:cNvGraphicFramePr>
+              <a:graphicFrameLocks xmlns:a="http://schemas.openxmlformats.org/drawingml/2006/main" noChangeAspect="1"/>
+            </wp:cNvGraphicFramePr>
+            <a:graphic xmlns:a="http://schemas.openxmlformats.org/drawingml/2006/main">
+              <a:graphicData uri="http://schemas.openxmlformats.org/drawingml/2006/picture">
+                <pic:pic xmlns:pic="http://schemas.openxmlformats.org/drawingml/2006/picture">
+                  <pic:nvPicPr>
+                    <pic:cNvPr id="1" name="Imagen 1"/>
+                    <pic:cNvPicPr/>
+                  </pic:nvPicPr>
+                  <pic:blipFill>
+                    <a:blip r:embed="rId4" cstate="print">
+                      <a:extLst>
+                        <a:ext uri="{28A0092B-C50C-407E-A947-70E740481C1C}">
+                          <a14:useLocalDpi xmlns:a14="http://schemas.microsoft.com/office/drawing/2010/main" val="0"/>
+                        </a:ext>
+                      </a:extLst>
+                    </a:blip>
+                    <a:stretch>
+                      <a:fillRect/>
+                    </a:stretch>
+                  </pic:blipFill>
+                  <pic:spPr>
+                    <a:xfrm>
+                      <a:off x="0" y="0"/>
+                      <a:ext cx="3270250" cy="1772285"/>
+                    </a:xfrm>
+                    <a:prstGeom prst="rect">
+                      <a:avLst/>
+                    </a:prstGeom>
+                  </pic:spPr>
+                </pic:pic>
+              </a:graphicData>
+            </a:graphic>
+            <wp14:sizeRelH relativeFrom="margin">
+              <wp14:pctWidth>0</wp14:pctWidth>
+            </wp14:sizeRelH>
+            <wp14:sizeRelV relativeFrom="margin">
+              <wp14:pctHeight>0</wp14:pctHeight>
+            </wp14:sizeRelV>
+          </wp:anchor>
+        </w:drawing>
+      </w:r>
+      <w:r>
+        <w:rPr>
+          <w:noProof/>
+        </w:rPr>
+        <w:drawing>
+          <wp:anchor distT="0" distB="0" distL="114300" distR="114300" simplePos="0" relativeHeight="251665408" behindDoc="0" locked="0" layoutInCell="1" allowOverlap="1" wp14:anchorId="195F873A" wp14:editId="3F6A31E2">
+            <wp:simplePos x="0" y="0"/>
+            <wp:positionH relativeFrom="column">
+              <wp:posOffset>5805170</wp:posOffset>
+            </wp:positionH>
+            <wp:positionV relativeFrom="paragraph">
+              <wp:posOffset>-914400</wp:posOffset>
+            </wp:positionV>
+            <wp:extent cx="3270250" cy="1772285"/>
+            <wp:effectExtent l="0" t="0" r="6350" b="0"/>
+            <wp:wrapNone/>
+            <wp:docPr id="13" name="Imagen 13"/>
+            <wp:cNvGraphicFramePr>
+              <a:graphicFrameLocks xmlns:a="http://schemas.openxmlformats.org/drawingml/2006/main" noChangeAspect="1"/>
+            </wp:cNvGraphicFramePr>
+            <a:graphic xmlns:a="http://schemas.openxmlformats.org/drawingml/2006/main">
+              <a:graphicData uri="http://schemas.openxmlformats.org/drawingml/2006/picture">
+                <pic:pic xmlns:pic="http://schemas.openxmlformats.org/drawingml/2006/picture">
+                  <pic:nvPicPr>
+                    <pic:cNvPr id="1" name="Imagen 1"/>
+                    <pic:cNvPicPr/>
+                  </pic:nvPicPr>
+                  <pic:blipFill>
+                    <a:blip r:embed="rId4" cstate="print">
+                      <a:extLst>
+                        <a:ext uri="{28A0092B-C50C-407E-A947-70E740481C1C}">
+                          <a14:useLocalDpi xmlns:a14="http://schemas.microsoft.com/office/drawing/2010/main" val="0"/>
+                        </a:ext>
+                      </a:extLst>
+                    </a:blip>
+                    <a:stretch>
+                      <a:fillRect/>
+                    </a:stretch>
+                  </pic:blipFill>
+                  <pic:spPr>
+                    <a:xfrm>
+                      <a:off x="0" y="0"/>
+                      <a:ext cx="3270250" cy="1772285"/>
+                    </a:xfrm>
+                    <a:prstGeom prst="rect">
+                      <a:avLst/>
+                    </a:prstGeom>
+                  </pic:spPr>
+                </pic:pic>
+              </a:graphicData>
+            </a:graphic>
+            <wp14:sizeRelH relativeFrom="margin">
+              <wp14:pctWidth>0</wp14:pctWidth>
+            </wp14:sizeRelH>
+            <wp14:sizeRelV relativeFrom="margin">
+              <wp14:pctHeight>0</wp14:pctHeight>
+            </wp14:sizeRelV>
+          </wp:anchor>
+        </w:drawing>
+      </w:r>
+      <w:r>
+        <w:rPr>
+          <w:noProof/>
+        </w:rPr>
+        <w:drawing>
+          <wp:anchor distT="0" distB="0" distL="114300" distR="114300" simplePos="0" relativeHeight="251661312" behindDoc="0" locked="0" layoutInCell="1" allowOverlap="1" wp14:anchorId="4A09AFAB" wp14:editId="7D97B0E5">
+            <wp:simplePos x="0" y="0"/>
+            <wp:positionH relativeFrom="column">
+              <wp:posOffset>-804479</wp:posOffset>
+            </wp:positionH>
+            <wp:positionV relativeFrom="paragraph">
+              <wp:posOffset>-900297</wp:posOffset>
+            </wp:positionV>
+            <wp:extent cx="3270250" cy="1772321"/>
+            <wp:effectExtent l="0" t="0" r="6350" b="0"/>
+            <wp:wrapNone/>
+            <wp:docPr id="1" name="Imagen 1"/>
+            <wp:cNvGraphicFramePr>
+              <a:graphicFrameLocks xmlns:a="http://schemas.openxmlformats.org/drawingml/2006/main" noChangeAspect="1"/>
+            </wp:cNvGraphicFramePr>
+            <a:graphic xmlns:a="http://schemas.openxmlformats.org/drawingml/2006/main">
+              <a:graphicData uri="http://schemas.openxmlformats.org/drawingml/2006/picture">
+                <pic:pic xmlns:pic="http://schemas.openxmlformats.org/drawingml/2006/picture">
+                  <pic:nvPicPr>
+                    <pic:cNvPr id="1" name="Imagen 1"/>
+                    <pic:cNvPicPr/>
+                  </pic:nvPicPr>
+                  <pic:blipFill>
+                    <a:blip r:embed="rId4" cstate="print">
+                      <a:extLst>
+                        <a:ext uri="{28A0092B-C50C-407E-A947-70E740481C1C}">
+                          <a14:useLocalDpi xmlns:a14="http://schemas.microsoft.com/office/drawing/2010/main" val="0"/>
+                        </a:ext>
+                      </a:extLst>
+                    </a:blip>
+                    <a:stretch>
+                      <a:fillRect/>
+                    </a:stretch>
+                  </pic:blipFill>
+                  <pic:spPr>
+                    <a:xfrm>
+                      <a:off x="0" y="0"/>
+                      <a:ext cx="3270250" cy="1772321"/>
+                    </a:xfrm>
+                    <a:prstGeom prst="rect">
+                      <a:avLst/>
+                    </a:prstGeom>
+                  </pic:spPr>
+                </pic:pic>
+              </a:graphicData>
+            </a:graphic>
+            <wp14:sizeRelH relativeFrom="margin">
+              <wp14:pctWidth>0</wp14:pctWidth>
+            </wp14:sizeRelH>
+            <wp14:sizeRelV relativeFrom="margin">
+              <wp14:pctHeight>0</wp14:pctHeight>
+            </wp14:sizeRelV>
+          </wp:anchor>
+        </w:drawing>
+      </w:r>
+      <w:r>
+        <w:rPr>
+          <w:noProof/>
+        </w:rPr>
+        <w:drawing>
+          <wp:anchor distT="0" distB="0" distL="114300" distR="114300" simplePos="0" relativeHeight="251669504" behindDoc="0" locked="0" layoutInCell="1" allowOverlap="1" wp14:anchorId="2CAB5EC4" wp14:editId="15A888E0">
+            <wp:simplePos x="0" y="0"/>
+            <wp:positionH relativeFrom="column">
+              <wp:posOffset>5796915</wp:posOffset>
+            </wp:positionH>
+            <wp:positionV relativeFrom="paragraph">
+              <wp:posOffset>906780</wp:posOffset>
+            </wp:positionV>
+            <wp:extent cx="3270250" cy="1772285"/>
+            <wp:effectExtent l="0" t="0" r="6350" b="0"/>
+            <wp:wrapNone/>
+            <wp:docPr id="18" name="Imagen 18"/>
+            <wp:cNvGraphicFramePr>
+              <a:graphicFrameLocks xmlns:a="http://schemas.openxmlformats.org/drawingml/2006/main" noChangeAspect="1"/>
+            </wp:cNvGraphicFramePr>
+            <a:graphic xmlns:a="http://schemas.openxmlformats.org/drawingml/2006/main">
+              <a:graphicData uri="http://schemas.openxmlformats.org/drawingml/2006/picture">
+                <pic:pic xmlns:pic="http://schemas.openxmlformats.org/drawingml/2006/picture">
+                  <pic:nvPicPr>
+                    <pic:cNvPr id="1" name="Imagen 1"/>
+                    <pic:cNvPicPr/>
+                  </pic:nvPicPr>
+                  <pic:blipFill>
+                    <a:blip r:embed="rId4" cstate="print">
+                      <a:extLst>
+                        <a:ext uri="{28A0092B-C50C-407E-A947-70E740481C1C}">
+                          <a14:useLocalDpi xmlns:a14="http://schemas.microsoft.com/office/drawing/2010/main" val="0"/>
+                        </a:ext>
+                      </a:extLst>
+                    </a:blip>
+                    <a:stretch>
+                      <a:fillRect/>
+                    </a:stretch>
+                  </pic:blipFill>
+                  <pic:spPr>
+                    <a:xfrm>
+                      <a:off x="0" y="0"/>
+                      <a:ext cx="3270250" cy="1772285"/>
+                    </a:xfrm>
+                    <a:prstGeom prst="rect">
+                      <a:avLst/>
+                    </a:prstGeom>
+                  </pic:spPr>
+                </pic:pic>
+              </a:graphicData>
+            </a:graphic>
+            <wp14:sizeRelH relativeFrom="margin">
+              <wp14:pctWidth>0</wp14:pctWidth>
+            </wp14:sizeRelH>
+            <wp14:sizeRelV relativeFrom="margin">
+              <wp14:pctHeight>0</wp14:pctHeight>
+            </wp14:sizeRelV>
+          </wp:anchor>
+        </w:drawing>
+      </w:r>
+      <w:r>
+        <w:rPr>
+          <w:noProof/>
+        </w:rPr>
+        <w:drawing>
+          <wp:anchor distT="0" distB="0" distL="114300" distR="114300" simplePos="0" relativeHeight="251668480" behindDoc="0" locked="0" layoutInCell="1" allowOverlap="1" wp14:anchorId="59D9C1E0" wp14:editId="0ED4D2D2">
+            <wp:simplePos x="0" y="0"/>
+            <wp:positionH relativeFrom="column">
+              <wp:posOffset>2487295</wp:posOffset>
+            </wp:positionH>
+            <wp:positionV relativeFrom="paragraph">
+              <wp:posOffset>909320</wp:posOffset>
+            </wp:positionV>
+            <wp:extent cx="3270250" cy="1772285"/>
+            <wp:effectExtent l="0" t="0" r="6350" b="0"/>
+            <wp:wrapNone/>
+            <wp:docPr id="17" name="Imagen 17"/>
+            <wp:cNvGraphicFramePr>
+              <a:graphicFrameLocks xmlns:a="http://schemas.openxmlformats.org/drawingml/2006/main" noChangeAspect="1"/>
+            </wp:cNvGraphicFramePr>
+            <a:graphic xmlns:a="http://schemas.openxmlformats.org/drawingml/2006/main">
+              <a:graphicData uri="http://schemas.openxmlformats.org/drawingml/2006/picture">
+                <pic:pic xmlns:pic="http://schemas.openxmlformats.org/drawingml/2006/picture">
+                  <pic:nvPicPr>
+                    <pic:cNvPr id="1" name="Imagen 1"/>
+                    <pic:cNvPicPr/>
+                  </pic:nvPicPr>
+                  <pic:blipFill>
+                    <a:blip r:embed="rId4" cstate="print">
+                      <a:extLst>
+                        <a:ext uri="{28A0092B-C50C-407E-A947-70E740481C1C}">
+                          <a14:useLocalDpi xmlns:a14="http://schemas.microsoft.com/office/drawing/2010/main" val="0"/>
+                        </a:ext>
+                      </a:extLst>
+                    </a:blip>
+                    <a:stretch>
+                      <a:fillRect/>
+                    </a:stretch>
+                  </pic:blipFill>
+                  <pic:spPr>
+                    <a:xfrm>
+                      <a:off x="0" y="0"/>
+                      <a:ext cx="3270250" cy="1772285"/>
+                    </a:xfrm>
+                    <a:prstGeom prst="rect">
+                      <a:avLst/>
+                    </a:prstGeom>
+                  </pic:spPr>
+                </pic:pic>
+              </a:graphicData>
+            </a:graphic>
+            <wp14:sizeRelH relativeFrom="margin">
+              <wp14:pctWidth>0</wp14:pctWidth>
+            </wp14:sizeRelH>
+            <wp14:sizeRelV relativeFrom="margin">
+              <wp14:pctHeight>0</wp14:pctHeight>
+            </wp14:sizeRelV>
+          </wp:anchor>
+        </w:drawing>
+      </w:r>
+      <w:r>
+        <w:rPr>
+          <w:noProof/>
+        </w:rPr>
+        <w:drawing>
+          <wp:anchor distT="0" distB="0" distL="114300" distR="114300" simplePos="0" relativeHeight="251667456" behindDoc="0" locked="0" layoutInCell="1" allowOverlap="1" wp14:anchorId="790B5E40" wp14:editId="51ADAD0E">
+            <wp:simplePos x="0" y="0"/>
+            <wp:positionH relativeFrom="column">
+              <wp:posOffset>-811367</wp:posOffset>
+            </wp:positionH>
+            <wp:positionV relativeFrom="paragraph">
+              <wp:posOffset>920883</wp:posOffset>
+            </wp:positionV>
+            <wp:extent cx="3270250" cy="1772321"/>
+            <wp:effectExtent l="0" t="0" r="6350" b="0"/>
+            <wp:wrapNone/>
+            <wp:docPr id="16" name="Imagen 16"/>
+            <wp:cNvGraphicFramePr>
+              <a:graphicFrameLocks xmlns:a="http://schemas.openxmlformats.org/drawingml/2006/main" noChangeAspect="1"/>
+            </wp:cNvGraphicFramePr>
+            <a:graphic xmlns:a="http://schemas.openxmlformats.org/drawingml/2006/main">
+              <a:graphicData uri="http://schemas.openxmlformats.org/drawingml/2006/picture">
+                <pic:pic xmlns:pic="http://schemas.openxmlformats.org/drawingml/2006/picture">
+                  <pic:nvPicPr>
+                    <pic:cNvPr id="1" name="Imagen 1"/>
+                    <pic:cNvPicPr/>
+                  </pic:nvPicPr>
+                  <pic:blipFill>
+                    <a:blip r:embed="rId4" cstate="print">
+                      <a:extLst>
+                        <a:ext uri="{28A0092B-C50C-407E-A947-70E740481C1C}">
+                          <a14:useLocalDpi xmlns:a14="http://schemas.microsoft.com/office/drawing/2010/main" val="0"/>
+                        </a:ext>
+                      </a:extLst>
+                    </a:blip>
+                    <a:stretch>
+                      <a:fillRect/>
+                    </a:stretch>
+                  </pic:blipFill>
+                  <pic:spPr>
+                    <a:xfrm>
+                      <a:off x="0" y="0"/>
+                      <a:ext cx="3270250" cy="1772321"/>
+                    </a:xfrm>
+                    <a:prstGeom prst="rect">
+                      <a:avLst/>
+                    </a:prstGeom>
+                  </pic:spPr>
+                </pic:pic>
+              </a:graphicData>
+            </a:graphic>
+            <wp14:sizeRelH relativeFrom="margin">
+              <wp14:pctWidth>0</wp14:pctWidth>
+            </wp14:sizeRelH>
+            <wp14:sizeRelV relativeFrom="margin">
+              <wp14:pctHeight>0</wp14:pctHeight>
+            </wp14:sizeRelV>
+          </wp:anchor>
+        </w:drawing>
+      </w:r>
+      <w:r>
+        <w:rPr>
+          <w:noProof/>
+        </w:rPr>
+        <w:drawing>
+          <wp:anchor distT="0" distB="0" distL="114300" distR="114300" simplePos="0" relativeHeight="251673600" behindDoc="0" locked="0" layoutInCell="1" allowOverlap="1" wp14:anchorId="7B7AA146" wp14:editId="6C31E867">
+            <wp:simplePos x="0" y="0"/>
+            <wp:positionH relativeFrom="column">
+              <wp:posOffset>5800090</wp:posOffset>
+            </wp:positionH>
+            <wp:positionV relativeFrom="paragraph">
+              <wp:posOffset>2735580</wp:posOffset>
+            </wp:positionV>
+            <wp:extent cx="3270250" cy="1772285"/>
+            <wp:effectExtent l="0" t="0" r="6350" b="0"/>
+            <wp:wrapNone/>
+            <wp:docPr id="21" name="Imagen 21"/>
+            <wp:cNvGraphicFramePr>
+              <a:graphicFrameLocks xmlns:a="http://schemas.openxmlformats.org/drawingml/2006/main" noChangeAspect="1"/>
+            </wp:cNvGraphicFramePr>
+            <a:graphic xmlns:a="http://schemas.openxmlformats.org/drawingml/2006/main">
+              <a:graphicData uri="http://schemas.openxmlformats.org/drawingml/2006/picture">
+                <pic:pic xmlns:pic="http://schemas.openxmlformats.org/drawingml/2006/picture">
+                  <pic:nvPicPr>
+                    <pic:cNvPr id="1" name="Imagen 1"/>
+                    <pic:cNvPicPr/>
+                  </pic:nvPicPr>
+                  <pic:blipFill>
+                    <a:blip r:embed="rId4" cstate="print">
+                      <a:extLst>
+                        <a:ext uri="{28A0092B-C50C-407E-A947-70E740481C1C}">
+                          <a14:useLocalDpi xmlns:a14="http://schemas.microsoft.com/office/drawing/2010/main" val="0"/>
+                        </a:ext>
+                      </a:extLst>
+                    </a:blip>
+                    <a:stretch>
+                      <a:fillRect/>
+                    </a:stretch>
+                  </pic:blipFill>
+                  <pic:spPr>
+                    <a:xfrm>
+                      <a:off x="0" y="0"/>
+                      <a:ext cx="3270250" cy="1772285"/>
+                    </a:xfrm>
+                    <a:prstGeom prst="rect">
+                      <a:avLst/>
+                    </a:prstGeom>
+                  </pic:spPr>
+                </pic:pic>
+              </a:graphicData>
+            </a:graphic>
+            <wp14:sizeRelH relativeFrom="margin">
+              <wp14:pctWidth>0</wp14:pctWidth>
+            </wp14:sizeRelH>
+            <wp14:sizeRelV relativeFrom="margin">
+              <wp14:pctHeight>0</wp14:pctHeight>
+            </wp14:sizeRelV>
+          </wp:anchor>
+        </w:drawing>
+      </w:r>
+      <w:r>
+        <w:rPr>
+          <w:noProof/>
+        </w:rPr>
+        <w:drawing>
+          <wp:anchor distT="0" distB="0" distL="114300" distR="114300" simplePos="0" relativeHeight="251672576" behindDoc="0" locked="0" layoutInCell="1" allowOverlap="1" wp14:anchorId="6699676E" wp14:editId="113CFFE7">
+            <wp:simplePos x="0" y="0"/>
+            <wp:positionH relativeFrom="column">
+              <wp:posOffset>2490470</wp:posOffset>
+            </wp:positionH>
+            <wp:positionV relativeFrom="paragraph">
+              <wp:posOffset>2738120</wp:posOffset>
+            </wp:positionV>
+            <wp:extent cx="3270250" cy="1772285"/>
+            <wp:effectExtent l="0" t="0" r="6350" b="0"/>
+            <wp:wrapNone/>
+            <wp:docPr id="20" name="Imagen 20"/>
+            <wp:cNvGraphicFramePr>
+              <a:graphicFrameLocks xmlns:a="http://schemas.openxmlformats.org/drawingml/2006/main" noChangeAspect="1"/>
+            </wp:cNvGraphicFramePr>
+            <a:graphic xmlns:a="http://schemas.openxmlformats.org/drawingml/2006/main">
+              <a:graphicData uri="http://schemas.openxmlformats.org/drawingml/2006/picture">
+                <pic:pic xmlns:pic="http://schemas.openxmlformats.org/drawingml/2006/picture">
+                  <pic:nvPicPr>
+                    <pic:cNvPr id="1" name="Imagen 1"/>
+                    <pic:cNvPicPr/>
+                  </pic:nvPicPr>
+                  <pic:blipFill>
+                    <a:blip r:embed="rId4" cstate="print">
+                      <a:extLst>
+                        <a:ext uri="{28A0092B-C50C-407E-A947-70E740481C1C}">
+                          <a14:useLocalDpi xmlns:a14="http://schemas.microsoft.com/office/drawing/2010/main" val="0"/>
+                        </a:ext>
+                      </a:extLst>
+                    </a:blip>
+                    <a:stretch>
+                      <a:fillRect/>
+                    </a:stretch>
+                  </pic:blipFill>
+                  <pic:spPr>
+                    <a:xfrm>
+                      <a:off x="0" y="0"/>
+                      <a:ext cx="3270250" cy="1772285"/>
+                    </a:xfrm>
+                    <a:prstGeom prst="rect">
+                      <a:avLst/>
+                    </a:prstGeom>
+                  </pic:spPr>
+                </pic:pic>
+              </a:graphicData>
+            </a:graphic>
+            <wp14:sizeRelH relativeFrom="margin">
+              <wp14:pctWidth>0</wp14:pctWidth>
+            </wp14:sizeRelH>
+            <wp14:sizeRelV relativeFrom="margin">
+              <wp14:pctHeight>0</wp14:pctHeight>
+            </wp14:sizeRelV>
+          </wp:anchor>
+        </w:drawing>
+      </w:r>
+      <w:r>
+        <w:rPr>
+          <w:noProof/>
+        </w:rPr>
+        <w:drawing>
+          <wp:anchor distT="0" distB="0" distL="114300" distR="114300" simplePos="0" relativeHeight="251671552" behindDoc="0" locked="0" layoutInCell="1" allowOverlap="1" wp14:anchorId="5A1B79A7" wp14:editId="7BC35FBE">
+            <wp:simplePos x="0" y="0"/>
+            <wp:positionH relativeFrom="column">
+              <wp:posOffset>-807085</wp:posOffset>
+            </wp:positionH>
+            <wp:positionV relativeFrom="paragraph">
+              <wp:posOffset>2749683</wp:posOffset>
+            </wp:positionV>
+            <wp:extent cx="3270250" cy="1772321"/>
+            <wp:effectExtent l="0" t="0" r="6350" b="0"/>
+            <wp:wrapNone/>
+            <wp:docPr id="19" name="Imagen 19"/>
+            <wp:cNvGraphicFramePr>
+              <a:graphicFrameLocks xmlns:a="http://schemas.openxmlformats.org/drawingml/2006/main" noChangeAspect="1"/>
+            </wp:cNvGraphicFramePr>
+            <a:graphic xmlns:a="http://schemas.openxmlformats.org/drawingml/2006/main">
+              <a:graphicData uri="http://schemas.openxmlformats.org/drawingml/2006/picture">
+                <pic:pic xmlns:pic="http://schemas.openxmlformats.org/drawingml/2006/picture">
+                  <pic:nvPicPr>
+                    <pic:cNvPr id="1" name="Imagen 1"/>
+                    <pic:cNvPicPr/>
+                  </pic:nvPicPr>
+                  <pic:blipFill>
+                    <a:blip r:embed="rId4" cstate="print">
+                      <a:extLst>
+                        <a:ext uri="{28A0092B-C50C-407E-A947-70E740481C1C}">
+                          <a14:useLocalDpi xmlns:a14="http://schemas.microsoft.com/office/drawing/2010/main" val="0"/>
+                        </a:ext>
+                      </a:extLst>
+                    </a:blip>
+                    <a:stretch>
+                      <a:fillRect/>
+                    </a:stretch>
+                  </pic:blipFill>
+                  <pic:spPr>
+                    <a:xfrm>
+                      <a:off x="0" y="0"/>
+                      <a:ext cx="3270250" cy="1772321"/>
                     </a:xfrm>
                     <a:prstGeom prst="rect">
                       <a:avLst/>

</xml_diff>